<commit_message>
Acrescenta a capa ao artigo em Word.
Co-authored-by: Cursor <cursoragent@cursor.com>
</commit_message>
<xml_diff>
--- a/Artigo/EducaChat_Artigo_Extensionista.docx
+++ b/Artigo/EducaChat_Artigo_Extensionista.docx
@@ -4,6 +4,119 @@
   <w:body>
     <w:p>
       <w:pPr>
+        <w:jc w:val="center"/>
+      </w:pPr>
+      <w:r>
+        <w:rPr>
+          <w:b/>
+          <w:bCs/>
+        </w:rPr>
+        <w:t xml:space="preserve">ETEP FACULDADES</w:t>
+      </w:r>
+    </w:p>
+    <w:p>
+      <w:pPr>
+        <w:jc w:val="center"/>
+      </w:pPr>
+      <w:r>
+        <w:t xml:space="preserve">Projeto Multidisciplinar — 2026.2</w:t>
+      </w:r>
+    </w:p>
+    <w:p/>
+    <w:p/>
+    <w:p/>
+    <w:p/>
+    <w:p>
+      <w:pPr>
+        <w:jc w:val="center"/>
+      </w:pPr>
+      <w:r>
+        <w:t xml:space="preserve">THIAGO MARCELINO DOS REIS</w:t>
+      </w:r>
+    </w:p>
+    <w:p>
+      <w:pPr>
+        <w:jc w:val="center"/>
+      </w:pPr>
+      <w:r>
+        <w:t xml:space="preserve">Análise e Desenvolvimento de Sistemas</w:t>
+      </w:r>
+    </w:p>
+    <w:p/>
+    <w:p>
+      <w:pPr>
+        <w:jc w:val="center"/>
+      </w:pPr>
+      <w:r>
+        <w:t xml:space="preserve">MARCUS PAULO PEREIRA DE OLIVEIRA</w:t>
+      </w:r>
+    </w:p>
+    <w:p>
+      <w:pPr>
+        <w:jc w:val="center"/>
+      </w:pPr>
+      <w:r>
+        <w:t xml:space="preserve">Ciência da Computação</w:t>
+      </w:r>
+    </w:p>
+    <w:p/>
+    <w:p/>
+    <w:p/>
+    <w:p/>
+    <w:p>
+      <w:pPr>
+        <w:jc w:val="center"/>
+      </w:pPr>
+      <w:r>
+        <w:rPr>
+          <w:b/>
+          <w:bCs/>
+        </w:rPr>
+        <w:t xml:space="preserve">EDUCACHAT</w:t>
+      </w:r>
+    </w:p>
+    <w:p>
+      <w:pPr>
+        <w:jc w:val="center"/>
+      </w:pPr>
+      <w:r>
+        <w:t xml:space="preserve">assistente de estudos alinhado à BNCC para estudantes do Ensino Fundamental II</w:t>
+      </w:r>
+    </w:p>
+    <w:p/>
+    <w:p/>
+    <w:p>
+      <w:pPr>
+        <w:jc w:val="center"/>
+      </w:pPr>
+      <w:r>
+        <w:t xml:space="preserve">Artigo extensionista</w:t>
+      </w:r>
+    </w:p>
+    <w:p/>
+    <w:p/>
+    <w:p/>
+    <w:p/>
+    <w:p/>
+    <w:p>
+      <w:pPr>
+        <w:jc w:val="center"/>
+      </w:pPr>
+      <w:r>
+        <w:t xml:space="preserve">São José dos Campos</w:t>
+      </w:r>
+    </w:p>
+    <w:p>
+      <w:pPr>
+        <w:jc w:val="center"/>
+      </w:pPr>
+      <w:r>
+        <w:t xml:space="preserve">2026</w:t>
+      </w:r>
+    </w:p>
+    <w:p>
+      <w:pPr>
+        <w:pageBreakBefore/>
         <w:spacing w:after="60" w:before="0"/>
         <w:jc w:val="center"/>
       </w:pPr>
@@ -217,7 +330,7 @@
           <w:b/>
           <w:bCs/>
         </w:rPr>
-        <w:t xml:space="preserve">	3</w:t>
+        <w:t xml:space="preserve">	4</w:t>
       </w:r>
     </w:p>
     <w:p>
@@ -239,7 +352,7 @@
           <w:b w:val="false"/>
           <w:bCs w:val="false"/>
         </w:rPr>
-        <w:t xml:space="preserve">	4</w:t>
+        <w:t xml:space="preserve">	5</w:t>
       </w:r>
     </w:p>
     <w:p>
@@ -261,7 +374,7 @@
           <w:b/>
           <w:bCs/>
         </w:rPr>
-        <w:t xml:space="preserve">	5</w:t>
+        <w:t xml:space="preserve">	6</w:t>
       </w:r>
     </w:p>
     <w:p>
@@ -283,7 +396,7 @@
           <w:b/>
           <w:bCs/>
         </w:rPr>
-        <w:t xml:space="preserve">	7</w:t>
+        <w:t xml:space="preserve">	8</w:t>
       </w:r>
     </w:p>
     <w:p>
@@ -305,7 +418,7 @@
           <w:b w:val="false"/>
           <w:bCs w:val="false"/>
         </w:rPr>
-        <w:t xml:space="preserve">	8</w:t>
+        <w:t xml:space="preserve">	9</w:t>
       </w:r>
     </w:p>
     <w:p>
@@ -327,7 +440,7 @@
           <w:b w:val="false"/>
           <w:bCs w:val="false"/>
         </w:rPr>
-        <w:t xml:space="preserve">	8</w:t>
+        <w:t xml:space="preserve">	9</w:t>
       </w:r>
     </w:p>
     <w:p>
@@ -349,7 +462,7 @@
           <w:b w:val="false"/>
           <w:bCs w:val="false"/>
         </w:rPr>
-        <w:t xml:space="preserve">	9</w:t>
+        <w:t xml:space="preserve">	10</w:t>
       </w:r>
     </w:p>
     <w:p>
@@ -371,7 +484,7 @@
           <w:b w:val="false"/>
           <w:bCs w:val="false"/>
         </w:rPr>
-        <w:t xml:space="preserve">	9</w:t>
+        <w:t xml:space="preserve">	10</w:t>
       </w:r>
     </w:p>
     <w:p>
@@ -393,7 +506,7 @@
           <w:b w:val="false"/>
           <w:bCs w:val="false"/>
         </w:rPr>
-        <w:t xml:space="preserve">	10</w:t>
+        <w:t xml:space="preserve">	11</w:t>
       </w:r>
     </w:p>
     <w:p>
@@ -415,7 +528,7 @@
           <w:b/>
           <w:bCs/>
         </w:rPr>
-        <w:t xml:space="preserve">	10</w:t>
+        <w:t xml:space="preserve">	11</w:t>
       </w:r>
     </w:p>
     <w:p>
@@ -437,7 +550,7 @@
           <w:b w:val="false"/>
           <w:bCs w:val="false"/>
         </w:rPr>
-        <w:t xml:space="preserve">	10</w:t>
+        <w:t xml:space="preserve">	11</w:t>
       </w:r>
     </w:p>
     <w:p>
@@ -459,7 +572,7 @@
           <w:b w:val="false"/>
           <w:bCs w:val="false"/>
         </w:rPr>
-        <w:t xml:space="preserve">	12</w:t>
+        <w:t xml:space="preserve">	13</w:t>
       </w:r>
     </w:p>
     <w:p>
@@ -481,7 +594,7 @@
           <w:b w:val="false"/>
           <w:bCs w:val="false"/>
         </w:rPr>
-        <w:t xml:space="preserve">	12</w:t>
+        <w:t xml:space="preserve">	13</w:t>
       </w:r>
     </w:p>
     <w:p>
@@ -503,7 +616,7 @@
           <w:b w:val="false"/>
           <w:bCs w:val="false"/>
         </w:rPr>
-        <w:t xml:space="preserve">	12</w:t>
+        <w:t xml:space="preserve">	13</w:t>
       </w:r>
     </w:p>
     <w:p>
@@ -525,7 +638,7 @@
           <w:b/>
           <w:bCs/>
         </w:rPr>
-        <w:t xml:space="preserve">	12</w:t>
+        <w:t xml:space="preserve">	13</w:t>
       </w:r>
     </w:p>
     <w:p>
@@ -547,7 +660,7 @@
           <w:b/>
           <w:bCs/>
         </w:rPr>
-        <w:t xml:space="preserve">	12</w:t>
+        <w:t xml:space="preserve">	13</w:t>
       </w:r>
     </w:p>
     <w:p>
@@ -569,7 +682,7 @@
           <w:b/>
           <w:bCs/>
         </w:rPr>
-        <w:t xml:space="preserve">	14</w:t>
+        <w:t xml:space="preserve">	15</w:t>
       </w:r>
     </w:p>
     <w:p>

</xml_diff>

<commit_message>
Ajusta o espaçamento da capa para a cidade e o ano não passarem para a página 2.
Co-authored-by: Cursor <cursoragent@cursor.com>
</commit_message>
<xml_diff>
--- a/Artigo/EducaChat_Artigo_Extensionista.docx
+++ b/Artigo/EducaChat_Artigo_Extensionista.docx
@@ -4,6 +4,7 @@
   <w:body>
     <w:p>
       <w:pPr>
+        <w:spacing w:after="0" w:before="0" w:line="360"/>
         <w:jc w:val="center"/>
       </w:pPr>
       <w:r>
@@ -16,18 +17,36 @@
     </w:p>
     <w:p>
       <w:pPr>
+        <w:spacing w:after="0" w:before="0" w:line="360"/>
         <w:jc w:val="center"/>
       </w:pPr>
       <w:r>
         <w:t xml:space="preserve">Projeto Multidisciplinar — 2026.2</w:t>
       </w:r>
     </w:p>
-    <w:p/>
-    <w:p/>
-    <w:p/>
-    <w:p/>
-    <w:p>
-      <w:pPr>
+    <w:p>
+      <w:pPr>
+        <w:spacing w:after="0" w:before="0" w:line="360"/>
+      </w:pPr>
+    </w:p>
+    <w:p>
+      <w:pPr>
+        <w:spacing w:after="0" w:before="0" w:line="360"/>
+      </w:pPr>
+    </w:p>
+    <w:p>
+      <w:pPr>
+        <w:spacing w:after="0" w:before="0" w:line="360"/>
+      </w:pPr>
+    </w:p>
+    <w:p>
+      <w:pPr>
+        <w:spacing w:after="0" w:before="0" w:line="360"/>
+      </w:pPr>
+    </w:p>
+    <w:p>
+      <w:pPr>
+        <w:spacing w:after="0" w:before="0" w:line="360"/>
         <w:jc w:val="center"/>
       </w:pPr>
       <w:r>
@@ -36,15 +55,21 @@
     </w:p>
     <w:p>
       <w:pPr>
+        <w:spacing w:after="0" w:before="0" w:line="360"/>
         <w:jc w:val="center"/>
       </w:pPr>
       <w:r>
         <w:t xml:space="preserve">Análise e Desenvolvimento de Sistemas</w:t>
       </w:r>
     </w:p>
-    <w:p/>
-    <w:p>
-      <w:pPr>
+    <w:p>
+      <w:pPr>
+        <w:spacing w:after="0" w:before="0" w:line="360"/>
+      </w:pPr>
+    </w:p>
+    <w:p>
+      <w:pPr>
+        <w:spacing w:after="0" w:before="0" w:line="360"/>
         <w:jc w:val="center"/>
       </w:pPr>
       <w:r>
@@ -53,18 +78,36 @@
     </w:p>
     <w:p>
       <w:pPr>
+        <w:spacing w:after="0" w:before="0" w:line="360"/>
         <w:jc w:val="center"/>
       </w:pPr>
       <w:r>
         <w:t xml:space="preserve">Ciência da Computação</w:t>
       </w:r>
     </w:p>
-    <w:p/>
-    <w:p/>
-    <w:p/>
-    <w:p/>
-    <w:p>
-      <w:pPr>
+    <w:p>
+      <w:pPr>
+        <w:spacing w:after="0" w:before="0" w:line="360"/>
+      </w:pPr>
+    </w:p>
+    <w:p>
+      <w:pPr>
+        <w:spacing w:after="0" w:before="0" w:line="360"/>
+      </w:pPr>
+    </w:p>
+    <w:p>
+      <w:pPr>
+        <w:spacing w:after="0" w:before="0" w:line="360"/>
+      </w:pPr>
+    </w:p>
+    <w:p>
+      <w:pPr>
+        <w:spacing w:after="0" w:before="0" w:line="360"/>
+      </w:pPr>
+    </w:p>
+    <w:p>
+      <w:pPr>
+        <w:spacing w:after="0" w:before="0" w:line="360"/>
         <w:jc w:val="center"/>
       </w:pPr>
       <w:r>
@@ -77,29 +120,80 @@
     </w:p>
     <w:p>
       <w:pPr>
+        <w:spacing w:after="0" w:before="0" w:line="360"/>
         <w:jc w:val="center"/>
       </w:pPr>
       <w:r>
         <w:t xml:space="preserve">assistente de estudos alinhado à BNCC para estudantes do Ensino Fundamental II</w:t>
       </w:r>
     </w:p>
-    <w:p/>
-    <w:p/>
-    <w:p>
-      <w:pPr>
+    <w:p>
+      <w:pPr>
+        <w:spacing w:after="0" w:before="0" w:line="360"/>
+      </w:pPr>
+    </w:p>
+    <w:p>
+      <w:pPr>
+        <w:spacing w:after="0" w:before="0" w:line="360"/>
+      </w:pPr>
+    </w:p>
+    <w:p>
+      <w:pPr>
+        <w:spacing w:after="0" w:before="0" w:line="360"/>
         <w:jc w:val="center"/>
       </w:pPr>
       <w:r>
         <w:t xml:space="preserve">Artigo extensionista</w:t>
       </w:r>
     </w:p>
-    <w:p/>
-    <w:p/>
-    <w:p/>
-    <w:p/>
-    <w:p/>
-    <w:p>
-      <w:pPr>
+    <w:p>
+      <w:pPr>
+        <w:spacing w:after="0" w:before="0" w:line="360"/>
+      </w:pPr>
+    </w:p>
+    <w:p>
+      <w:pPr>
+        <w:spacing w:after="0" w:before="0" w:line="360"/>
+      </w:pPr>
+    </w:p>
+    <w:p>
+      <w:pPr>
+        <w:spacing w:after="0" w:before="0" w:line="360"/>
+      </w:pPr>
+    </w:p>
+    <w:p>
+      <w:pPr>
+        <w:spacing w:after="0" w:before="0" w:line="360"/>
+      </w:pPr>
+    </w:p>
+    <w:p>
+      <w:pPr>
+        <w:spacing w:after="0" w:before="0" w:line="360"/>
+      </w:pPr>
+    </w:p>
+    <w:p>
+      <w:pPr>
+        <w:spacing w:after="0" w:before="0" w:line="360"/>
+      </w:pPr>
+    </w:p>
+    <w:p>
+      <w:pPr>
+        <w:spacing w:after="0" w:before="0" w:line="360"/>
+      </w:pPr>
+    </w:p>
+    <w:p>
+      <w:pPr>
+        <w:spacing w:after="0" w:before="0" w:line="360"/>
+      </w:pPr>
+    </w:p>
+    <w:p>
+      <w:pPr>
+        <w:spacing w:after="0" w:before="0" w:line="360"/>
+      </w:pPr>
+    </w:p>
+    <w:p>
+      <w:pPr>
+        <w:spacing w:after="0" w:before="0" w:line="360"/>
         <w:jc w:val="center"/>
       </w:pPr>
       <w:r>
@@ -108,6 +202,7 @@
     </w:p>
     <w:p>
       <w:pPr>
+        <w:spacing w:after="0" w:before="0" w:line="360"/>
         <w:jc w:val="center"/>
       </w:pPr>
       <w:r>

</xml_diff>